<commit_message>
Alinea plantillas de certificados con arquitectura
</commit_message>
<xml_diff>
--- a/Plantillas/Certificado_Conformidad.docx
+++ b/Plantillas/Certificado_Conformidad.docx
@@ -387,13 +387,11 @@
                 <w:rFonts w:ascii="Arial" w:cs="Arial" w:eastAsia="Arial" w:hAnsi="Arial"/>
                 <w:rtl w:val="0"/>
               </w:rPr>
-              <w:t xml:space="preserve">$</w:t>
             </w:r>
             <w:r>
               <w:rPr>
                 <w:rtl w:val="0"/>
               </w:rPr>
-              <w:t xml:space="preserve"> </w:t>
             </w:r>
             <w:r>
               <w:rPr>
@@ -576,6 +574,61 @@
           </w:p>
         </w:tc>
       </w:tr>
+      <w:tr>
+        <w:trPr>
+          <w:cantSplit w:val="0"/>
+          <w:tblHeader w:val="0"/>
+        </w:trPr>
+        <w:tc>
+          <w:tcPr/>
+          <w:p>
+            <w:pPr>
+              <w:spacing w:after="160" w:line="259" w:lineRule="auto"/>
+              <w:jc w:val="both"/>
+              <w:rPr>
+                <w:rFonts w:ascii="Arial" w:cs="Arial" w:eastAsia="Arial" w:hAnsi="Arial"/>
+                <w:b w:val="1"/>
+                <w:bCs w:val="1"/>
+              </w:rPr>
+            </w:pPr>
+            <w:r>
+              <w:rPr>
+                <w:rFonts w:ascii="Arial" w:cs="Arial" w:eastAsia="Arial" w:hAnsi="Arial"/>
+                <w:b w:val="1"/>
+                <w:bCs w:val="1"/>
+                <w:rtl w:val="0"/>
+              </w:rPr>
+              <w:t>Poder</w:t>
+            </w:r>
+          </w:p>
+        </w:tc>
+        <w:tc>
+          <w:tcPr/>
+          <w:p>
+            <w:pPr>
+              <w:spacing w:after="160" w:line="259" w:lineRule="auto"/>
+              <w:jc w:val="both"/>
+              <w:rPr>
+                <w:rFonts w:ascii="Arial" w:cs="Arial" w:eastAsia="Arial" w:hAnsi="Arial"/>
+              </w:rPr>
+            </w:pPr>
+            <w:r>
+              <w:rPr>
+                <w:rFonts w:ascii="Arial" w:cs="Arial" w:eastAsia="Arial" w:hAnsi="Arial"/>
+                <w:b w:val="1"/>
+                <w:bCs w:val="1"/>
+                <w:rtl w:val="0"/>
+              </w:rPr>
+              <w:t>{{PODER_REFERENCIA}}</w:t>
+            </w:r>
+            <w:r>
+              <w:rPr>
+                <w:rtl w:val="0"/>
+              </w:rPr>
+            </w:r>
+          </w:p>
+        </w:tc>
+      </w:tr>
     </w:tbl>
     <w:p>
       <w:pPr>
@@ -691,6 +744,79 @@
           <w:rtl w:val="0"/>
         </w:rPr>
         <w:t xml:space="preserve">.</w:t>
+      </w:r>
+    </w:p>
+    <w:p>
+      <w:pPr>
+        <w:jc w:val="both"/>
+        <w:rPr>
+          <w:rFonts w:ascii="Arial" w:cs="Arial" w:eastAsia="Arial" w:hAnsi="Arial"/>
+          <w:sz w:val="20"/>
+          <w:szCs w:val="20"/>
+        </w:rPr>
+      </w:pPr>
+      <w:r>
+        <w:rPr>
+          <w:rFonts w:ascii="Arial" w:cs="Arial" w:eastAsia="Arial" w:hAnsi="Arial"/>
+          <w:sz w:val="20"/>
+          <w:szCs w:val="20"/>
+          <w:rtl w:val="0"/>
+        </w:rPr>
+        <w:t>{{CONCEPTO_JURIDICO}}</w:t>
+      </w:r>
+      <w:r>
+        <w:rPr>
+          <w:rFonts w:ascii="Arial" w:cs="Arial" w:eastAsia="Arial" w:hAnsi="Arial"/>
+          <w:b w:val="1"/>
+          <w:bCs w:val="1"/>
+          <w:sz w:val="20"/>
+          <w:szCs w:val="20"/>
+          <w:rtl w:val="0"/>
+        </w:rPr>
+      </w:r>
+      <w:r>
+        <w:rPr>
+          <w:rFonts w:ascii="Arial" w:cs="Arial" w:eastAsia="Arial" w:hAnsi="Arial"/>
+          <w:sz w:val="20"/>
+          <w:szCs w:val="20"/>
+          <w:rtl w:val="0"/>
+        </w:rPr>
+      </w:r>
+      <w:r>
+        <w:rPr>
+          <w:rFonts w:ascii="Arial" w:cs="Arial" w:eastAsia="Arial" w:hAnsi="Arial"/>
+          <w:b w:val="1"/>
+          <w:bCs w:val="1"/>
+          <w:sz w:val="20"/>
+          <w:szCs w:val="20"/>
+          <w:rtl w:val="0"/>
+        </w:rPr>
+      </w:r>
+      <w:r>
+        <w:rPr>
+          <w:rFonts w:ascii="Arial" w:cs="Arial" w:eastAsia="Arial" w:hAnsi="Arial"/>
+          <w:sz w:val="20"/>
+          <w:szCs w:val="20"/>
+          <w:rtl w:val="0"/>
+        </w:rPr>
+      </w:r>
+      <w:r>
+        <w:rPr>
+          <w:rFonts w:ascii="Arial" w:cs="Arial" w:eastAsia="Arial" w:hAnsi="Arial"/>
+          <w:b w:val="1"/>
+          <w:bCs w:val="1"/>
+          <w:sz w:val="20"/>
+          <w:szCs w:val="20"/>
+          <w:rtl w:val="0"/>
+        </w:rPr>
+      </w:r>
+      <w:r>
+        <w:rPr>
+          <w:rFonts w:ascii="Arial" w:cs="Arial" w:eastAsia="Arial" w:hAnsi="Arial"/>
+          <w:sz w:val="20"/>
+          <w:szCs w:val="20"/>
+          <w:rtl w:val="0"/>
+        </w:rPr>
       </w:r>
     </w:p>
     <w:p>

</xml_diff>

<commit_message>
Ajusta referencias y concepto en certificados
</commit_message>
<xml_diff>
--- a/Plantillas/Certificado_Conformidad.docx
+++ b/Plantillas/Certificado_Conformidad.docx
@@ -564,62 +564,7 @@
                 <w:bCs w:val="1"/>
                 <w:rtl w:val="0"/>
               </w:rPr>
-              <w:t xml:space="preserve">{{REFERENCIA_ESCRITURA}} </w:t>
-            </w:r>
-            <w:r>
-              <w:rPr>
-                <w:rtl w:val="0"/>
-              </w:rPr>
-            </w:r>
-          </w:p>
-        </w:tc>
-      </w:tr>
-      <w:tr>
-        <w:trPr>
-          <w:cantSplit w:val="0"/>
-          <w:tblHeader w:val="0"/>
-        </w:trPr>
-        <w:tc>
-          <w:tcPr/>
-          <w:p>
-            <w:pPr>
-              <w:spacing w:after="160" w:line="259" w:lineRule="auto"/>
-              <w:jc w:val="both"/>
-              <w:rPr>
-                <w:rFonts w:ascii="Arial" w:cs="Arial" w:eastAsia="Arial" w:hAnsi="Arial"/>
-                <w:b w:val="1"/>
-                <w:bCs w:val="1"/>
-              </w:rPr>
-            </w:pPr>
-            <w:r>
-              <w:rPr>
-                <w:rFonts w:ascii="Arial" w:cs="Arial" w:eastAsia="Arial" w:hAnsi="Arial"/>
-                <w:b w:val="1"/>
-                <w:bCs w:val="1"/>
-                <w:rtl w:val="0"/>
-              </w:rPr>
-              <w:t>Poder</w:t>
-            </w:r>
-          </w:p>
-        </w:tc>
-        <w:tc>
-          <w:tcPr/>
-          <w:p>
-            <w:pPr>
-              <w:spacing w:after="160" w:line="259" w:lineRule="auto"/>
-              <w:jc w:val="both"/>
-              <w:rPr>
-                <w:rFonts w:ascii="Arial" w:cs="Arial" w:eastAsia="Arial" w:hAnsi="Arial"/>
-              </w:rPr>
-            </w:pPr>
-            <w:r>
-              <w:rPr>
-                <w:rFonts w:ascii="Arial" w:cs="Arial" w:eastAsia="Arial" w:hAnsi="Arial"/>
-                <w:b w:val="1"/>
-                <w:bCs w:val="1"/>
-                <w:rtl w:val="0"/>
-              </w:rPr>
-              <w:t>{{PODER_REFERENCIA}}</w:t>
+              <w:t>{{REFERENCIA_ESCRITURA}} {{PODER_REFERENCIA}}</w:t>
             </w:r>
             <w:r>
               <w:rPr>
@@ -744,79 +689,6 @@
           <w:rtl w:val="0"/>
         </w:rPr>
         <w:t xml:space="preserve">.</w:t>
-      </w:r>
-    </w:p>
-    <w:p>
-      <w:pPr>
-        <w:jc w:val="both"/>
-        <w:rPr>
-          <w:rFonts w:ascii="Arial" w:cs="Arial" w:eastAsia="Arial" w:hAnsi="Arial"/>
-          <w:sz w:val="20"/>
-          <w:szCs w:val="20"/>
-        </w:rPr>
-      </w:pPr>
-      <w:r>
-        <w:rPr>
-          <w:rFonts w:ascii="Arial" w:cs="Arial" w:eastAsia="Arial" w:hAnsi="Arial"/>
-          <w:sz w:val="20"/>
-          <w:szCs w:val="20"/>
-          <w:rtl w:val="0"/>
-        </w:rPr>
-        <w:t>{{CONCEPTO_JURIDICO}}</w:t>
-      </w:r>
-      <w:r>
-        <w:rPr>
-          <w:rFonts w:ascii="Arial" w:cs="Arial" w:eastAsia="Arial" w:hAnsi="Arial"/>
-          <w:b w:val="1"/>
-          <w:bCs w:val="1"/>
-          <w:sz w:val="20"/>
-          <w:szCs w:val="20"/>
-          <w:rtl w:val="0"/>
-        </w:rPr>
-      </w:r>
-      <w:r>
-        <w:rPr>
-          <w:rFonts w:ascii="Arial" w:cs="Arial" w:eastAsia="Arial" w:hAnsi="Arial"/>
-          <w:sz w:val="20"/>
-          <w:szCs w:val="20"/>
-          <w:rtl w:val="0"/>
-        </w:rPr>
-      </w:r>
-      <w:r>
-        <w:rPr>
-          <w:rFonts w:ascii="Arial" w:cs="Arial" w:eastAsia="Arial" w:hAnsi="Arial"/>
-          <w:b w:val="1"/>
-          <w:bCs w:val="1"/>
-          <w:sz w:val="20"/>
-          <w:szCs w:val="20"/>
-          <w:rtl w:val="0"/>
-        </w:rPr>
-      </w:r>
-      <w:r>
-        <w:rPr>
-          <w:rFonts w:ascii="Arial" w:cs="Arial" w:eastAsia="Arial" w:hAnsi="Arial"/>
-          <w:sz w:val="20"/>
-          <w:szCs w:val="20"/>
-          <w:rtl w:val="0"/>
-        </w:rPr>
-      </w:r>
-      <w:r>
-        <w:rPr>
-          <w:rFonts w:ascii="Arial" w:cs="Arial" w:eastAsia="Arial" w:hAnsi="Arial"/>
-          <w:b w:val="1"/>
-          <w:bCs w:val="1"/>
-          <w:sz w:val="20"/>
-          <w:szCs w:val="20"/>
-          <w:rtl w:val="0"/>
-        </w:rPr>
-      </w:r>
-      <w:r>
-        <w:rPr>
-          <w:rFonts w:ascii="Arial" w:cs="Arial" w:eastAsia="Arial" w:hAnsi="Arial"/>
-          <w:sz w:val="20"/>
-          <w:szCs w:val="20"/>
-          <w:rtl w:val="0"/>
-        </w:rPr>
       </w:r>
     </w:p>
     <w:p>

</xml_diff>